<commit_message>
Update: notebook, models, reports, README
</commit_message>
<xml_diff>
--- a/report/SMS_Spam_Report.docx
+++ b/report/SMS_Spam_Report.docx
@@ -108,10 +108,6 @@
       <w:r>
         <w:br/>
         <w:t>- Cell 9: Saved the trained pipeline as .joblib and stored threshold + metadata.</w:t>
-      </w:r>
-      <w:r>
-        <w:br/>
-        <w:t>- Cell 10: Exported reports (classification report .txt, confusion matrix .png, PR curve .png, metrics summary .csv) to the report/ folder.</w:t>
       </w:r>
     </w:p>
     <w:p>

</xml_diff>